<commit_message>
docs: harden unified knowledge program gates
Co-authored-by: taylorvalton <taylorvalton@users.noreply.github.com>
</commit_message>
<xml_diff>
--- a/artifacts/platform/2026-07-29-unified-knowledge-architecture/unified-plx-document-knowledge-architecture.docx
+++ b/artifacts/platform/2026-07-29-unified-knowledge-architecture/unified-plx-document-knowledge-architecture.docx
@@ -98,13 +98,25 @@
         <w:t xml:space="preserve"> </w:t>
       </w:r>
       <w:r>
-        <w:t xml:space="preserve">gold tables; technical content remains authoritative in Git; execution remains</w:t>
-      </w:r>
-      <w:r>
-        <w:t xml:space="preserve"> </w:t>
-      </w:r>
-      <w:r>
-        <w:t xml:space="preserve">authoritative in Mission Control; DocuSign remains authoritative for envelope</w:t>
+        <w:t xml:space="preserve">gold tables; technical content remains authoritative in Git. SharePoint is the</w:t>
+      </w:r>
+      <w:r>
+        <w:t xml:space="preserve"> </w:t>
+      </w:r>
+      <w:r>
+        <w:t xml:space="preserve">system of record for Mission Control planning records, while Mission Control is</w:t>
+      </w:r>
+      <w:r>
+        <w:t xml:space="preserve"> </w:t>
+      </w:r>
+      <w:r>
+        <w:t xml:space="preserve">workflow authority for execution, routing, and evidence policy. DocuSign remains</w:t>
+      </w:r>
+      <w:r>
+        <w:t xml:space="preserve"> </w:t>
+      </w:r>
+      <w:r>
+        <w:t xml:space="preserve">authoritative for envelope</w:t>
       </w:r>
       <w:r>
         <w:t xml:space="preserve"> </w:t>
@@ -818,7 +830,49 @@
         <w:pStyle w:val="Compact"/>
       </w:pPr>
       <w:r>
-        <w:t xml:space="preserve">signature uniqueness, identity verification, and record linkage.</w:t>
+        <w:t xml:space="preserve">signature uniqueness, identity verification, and record linkage;</w:t>
+      </w:r>
+    </w:p>
+    <w:p>
+      <w:pPr>
+        <w:numPr>
+          <w:ilvl w:val="0"/>
+          <w:numId w:val="1004"/>
+        </w:numPr>
+        <w:pStyle w:val="Compact"/>
+      </w:pPr>
+      <w:r>
+        <w:t xml:space="preserve">closed/open system classification and corresponding additional controls;</w:t>
+      </w:r>
+    </w:p>
+    <w:p>
+      <w:pPr>
+        <w:numPr>
+          <w:ilvl w:val="0"/>
+          <w:numId w:val="1004"/>
+        </w:numPr>
+        <w:pStyle w:val="Compact"/>
+      </w:pPr>
+      <w:r>
+        <w:t xml:space="preserve">applicable FDA electronic-signature certification evidence;</w:t>
+      </w:r>
+    </w:p>
+    <w:p>
+      <w:pPr>
+        <w:numPr>
+          <w:ilvl w:val="0"/>
+          <w:numId w:val="1004"/>
+        </w:numPr>
+        <w:pStyle w:val="Compact"/>
+      </w:pPr>
+      <w:r>
+        <w:t xml:space="preserve">non-biometric signature components, signing-session behavior, and</w:t>
+      </w:r>
+      <w:r>
+        <w:t xml:space="preserve"> </w:t>
+      </w:r>
+      <w:r>
+        <w:t xml:space="preserve">genuine-owner controls.</w:t>
       </w:r>
     </w:p>
     <w:p>
@@ -965,7 +1019,7 @@
         <w:pStyle w:val="Compact"/>
       </w:pPr>
       <w:r>
-        <w:t xml:space="preserve">26 traced requirements;</w:t>
+        <w:t xml:space="preserve">30 traced requirements;</w:t>
       </w:r>
     </w:p>
     <w:p>
@@ -1577,6 +1631,33 @@
     </w:p>
     <w:p>
       <w:pPr>
+        <w:numPr>
+          <w:ilvl w:val="0"/>
+          <w:numId w:val="1006"/>
+        </w:numPr>
+        <w:pStyle w:val="Compact"/>
+      </w:pPr>
+      <w:r>
+        <w:t xml:space="preserve">the recurring mirror-is-boring gate reports live, fresh data with</w:t>
+      </w:r>
+      <w:r>
+        <w:t xml:space="preserve"> </w:t>
+      </w:r>
+      <w:r>
+        <w:rPr>
+          <w:rStyle w:val="VerbatimChar"/>
+        </w:rPr>
+        <w:t xml:space="preserve">boringGateMet</w:t>
+      </w:r>
+      <w:r>
+        <w:t xml:space="preserve"> </w:t>
+      </w:r>
+      <w:r>
+        <w:t xml:space="preserve">true before ontology, discovery, or another new plane starts.</w:t>
+      </w:r>
+    </w:p>
+    <w:p>
+      <w:pPr>
         <w:pStyle w:val="FirstParagraph"/>
       </w:pPr>
       <w:r>

</xml_diff>